<commit_message>
novos comentários para apresentação
</commit_message>
<xml_diff>
--- a/apresentacao/01_Roteiro_de_Fala_PFC2_Rafael_Melo.docx
+++ b/apresentacao/01_Roteiro_de_Fala_PFC2_Rafael_Melo.docx
@@ -2335,7 +2335,95 @@
         <w:t>Além disso, eu aplico o teste de Diebold–Mariano para verificar se diferenças entre modelos são estatisticamente defensáveis, usando perda direcional e perda Brier.</w:t>
       </w:r>
     </w:p>
+    <w:p>
+      <w:r>
+        <w:t xml:space="preserve">ACURÁCIA DIRECIONAL: </w:t>
+      </w:r>
+      <w:r>
+        <w:t>Consideramos acerto apenas quando o modelo prevê corretamente movimentos relevantes acima de 0,1%, ignorando ruído microestrutural.</w:t>
+      </w:r>
+    </w:p>
+    <w:p>
+      <w:r>
+        <w:t>O F1-score equilibra precisão e recall, sendo útil em cenários com possível desbalanceamento entre altas e baixas.</w:t>
+      </w:r>
+    </w:p>
+    <w:p>
+      <w:r>
+        <w:t>O MCC é uma métrica robusta para classificação binária, pois considera todos os quadrantes da matriz de confusão e se comporta como uma correlação entre predição e realidade.</w:t>
+      </w:r>
+    </w:p>
     <w:p/>
+    <w:p>
+      <w:r>
+        <w:t xml:space="preserve">BRIER SCORE: </w:t>
+      </w:r>
+      <w:r>
+        <w:t>Mede o erro quadrático entre probabilidade prevista e resultado real.</w:t>
+      </w:r>
+    </w:p>
+    <w:p/>
+    <w:p>
+      <w:pPr>
+        <w:rPr>
+          <w:b/>
+          <w:bCs/>
+          <w:lang w:val="pt-BR"/>
+        </w:rPr>
+      </w:pPr>
+      <w:r>
+        <w:rPr>
+          <w:lang w:val="pt-BR"/>
+        </w:rPr>
+        <w:t xml:space="preserve">SHARPE: </w:t>
+      </w:r>
+      <w:r>
+        <w:rPr>
+          <w:lang w:val="pt-BR"/>
+        </w:rPr>
+        <w:t>Retorno ajustado ao risco.</w:t>
+      </w:r>
+    </w:p>
+    <w:p>
+      <w:r>
+        <w:t xml:space="preserve">MAX DRAWDOWN: </w:t>
+      </w:r>
+      <w:r>
+        <w:t>Maior perda acumulada.</w:t>
+      </w:r>
+    </w:p>
+    <w:p>
+      <w:r>
+        <w:t xml:space="preserve">PROFIT FACTOR: </w:t>
+      </w:r>
+      <w:r>
+        <w:t>Soma ganhos / soma perdas.</w:t>
+      </w:r>
+    </w:p>
+    <w:p>
+      <w:r>
+        <w:t>NUMERO DE OPERAÇÕES: Evitar overtrading - Avaliar robustez</w:t>
+      </w:r>
+    </w:p>
+    <w:p/>
+    <w:p>
+      <w:pPr>
+        <w:rPr>
+          <w:b/>
+          <w:u w:val="single"/>
+        </w:rPr>
+      </w:pPr>
+      <w:r>
+        <w:t>Aplicamos o teste de Diebold–Mariano para verificar se a diferença de desempenho entre modelos é estatisticamente significativa, tanto na perda direcional quanto no Brier Score.</w:t>
+      </w:r>
+    </w:p>
+    <w:p>
+      <w:pPr>
+        <w:rPr>
+          <w:b/>
+        </w:rPr>
+      </w:pPr>
+    </w:p>
     <w:p>
       <w:r>
         <w:rPr>
@@ -2349,6 +2437,7 @@
         <w:pStyle w:val="Commarcadores"/>
       </w:pPr>
       <w:r>
+        <w:lastRenderedPageBreak/>
         <w:t>Citar só: “acurácia mascara colapso; eu uso MCC/F1 + DM + backtest”.</w:t>
       </w:r>
     </w:p>
@@ -4522,7 +4611,6 @@
   <w:style w:type="character" w:default="1" w:styleId="Fontepargpadro">
     <w:name w:val="Default Paragraph Font"/>
     <w:uiPriority w:val="1"/>
-    <w:semiHidden/>
     <w:unhideWhenUsed/>
   </w:style>
   <w:style w:type="table" w:default="1" w:styleId="Tabelanormal">

</xml_diff>